<commit_message>
Informado mudanças no doc do template do projeto
</commit_message>
<xml_diff>
--- a/Engenharia_de_Software/Trabalho_m1/DOCS_Gerais/templateprojeto.docx
+++ b/Engenharia_de_Software/Trabalho_m1/DOCS_Gerais/templateprojeto.docx
@@ -1352,8 +1352,6 @@
               </w:rPr>
               <w:t>https://github.com/EduardoFabeniJohannsen/Ciencia_da_Computacao_UNIVALI/commit/53798f1d258a111820756a87c6b1c74c7558873c</w:t>
             </w:r>
-            <w:bookmarkStart w:id="6" w:name="_GoBack"/>
-            <w:bookmarkEnd w:id="6"/>
           </w:p>
         </w:tc>
       </w:tr>
@@ -1536,6 +1534,9 @@
               <w:ind w:left="720" w:hanging="360"/>
               <w:jc w:val="center"/>
             </w:pPr>
+            <w:r>
+              <w:t>Eduardo Fabeni Johannsen</w:t>
+            </w:r>
           </w:p>
         </w:tc>
         <w:tc>
@@ -1584,6 +1585,12 @@
               <w:ind w:left="720" w:hanging="360"/>
               <w:jc w:val="center"/>
             </w:pPr>
+            <w:r>
+              <w:rPr>
+                <w:b/>
+              </w:rPr>
+              <w:t>SS</w:t>
+            </w:r>
           </w:p>
         </w:tc>
         <w:tc>
@@ -1608,6 +1615,31 @@
               <w:ind w:left="720" w:hanging="360"/>
               <w:jc w:val="center"/>
             </w:pPr>
+            <w:r>
+              <w:t xml:space="preserve">Link do </w:t>
+            </w:r>
+            <w:proofErr w:type="spellStart"/>
+            <w:r>
+              <w:t>commit</w:t>
+            </w:r>
+            <w:proofErr w:type="spellEnd"/>
+            <w:r>
+              <w:t>:</w:t>
+            </w:r>
+          </w:p>
+          <w:p>
+            <w:pPr>
+              <w:spacing w:before="240" w:after="240"/>
+              <w:ind w:left="720" w:hanging="360"/>
+              <w:jc w:val="center"/>
+            </w:pPr>
+            <w:r>
+              <w:rPr>
+                <w:sz w:val="12"/>
+                <w:szCs w:val="12"/>
+              </w:rPr>
+              <w:t>https://github.com/EduardoFabeniJohannsen/Ciencia_da_Computacao_UNIVALI/commit/a2fbd912fd2eeb60137bcb21d5494435ce52c588</w:t>
+            </w:r>
           </w:p>
         </w:tc>
       </w:tr>
@@ -1663,6 +1695,9 @@
               <w:ind w:left="720" w:hanging="360"/>
               <w:jc w:val="center"/>
             </w:pPr>
+            <w:r>
+              <w:t>Eduardo Fabeni Johannsen</w:t>
+            </w:r>
           </w:p>
         </w:tc>
         <w:tc>
@@ -1711,6 +1746,12 @@
               <w:ind w:left="720" w:hanging="360"/>
               <w:jc w:val="center"/>
             </w:pPr>
+            <w:r>
+              <w:rPr>
+                <w:b/>
+              </w:rPr>
+              <w:t>SS</w:t>
+            </w:r>
           </w:p>
         </w:tc>
         <w:tc>
@@ -1735,6 +1776,33 @@
               <w:ind w:left="720" w:hanging="360"/>
               <w:jc w:val="center"/>
             </w:pPr>
+            <w:r>
+              <w:t xml:space="preserve">Link do </w:t>
+            </w:r>
+            <w:proofErr w:type="spellStart"/>
+            <w:r>
+              <w:t>commit</w:t>
+            </w:r>
+            <w:proofErr w:type="spellEnd"/>
+            <w:r>
+              <w:t>:</w:t>
+            </w:r>
+          </w:p>
+          <w:p>
+            <w:pPr>
+              <w:spacing w:before="240" w:after="240"/>
+              <w:ind w:left="720" w:hanging="360"/>
+              <w:jc w:val="center"/>
+            </w:pPr>
+            <w:r>
+              <w:rPr>
+                <w:sz w:val="12"/>
+                <w:szCs w:val="12"/>
+              </w:rPr>
+              <w:t>https://github.com/EduardoFabeniJohannsen/Ciencia_da_Computacao_UNIVALI/commit/1088e9d697717376ff68984714b3020f7471c0d4</w:t>
+            </w:r>
+            <w:bookmarkStart w:id="6" w:name="_GoBack"/>
+            <w:bookmarkEnd w:id="6"/>
           </w:p>
         </w:tc>
       </w:tr>
@@ -1764,6 +1832,7 @@
               <w:spacing w:before="240" w:after="240"/>
             </w:pPr>
             <w:r>
+              <w:lastRenderedPageBreak/>
               <w:t>UC detalhado 3</w:t>
             </w:r>
           </w:p>
@@ -2018,7 +2087,6 @@
               <w:spacing w:before="240" w:after="240"/>
             </w:pPr>
             <w:r>
-              <w:lastRenderedPageBreak/>
               <w:t>(Somente V2) Modelo de domínio</w:t>
             </w:r>
           </w:p>
@@ -2770,6 +2838,7 @@
       <w:bookmarkStart w:id="10" w:name="_1c4vi9rg967t" w:colFirst="0" w:colLast="0"/>
       <w:bookmarkEnd w:id="10"/>
       <w:r>
+        <w:lastRenderedPageBreak/>
         <w:t>1.1 Contexto e problema (6–10 linhas)</w:t>
       </w:r>
     </w:p>
@@ -2843,7 +2912,6 @@
         <w:spacing w:before="240"/>
       </w:pPr>
       <w:r>
-        <w:lastRenderedPageBreak/>
         <w:t>Inserir diagrama BPMN</w:t>
       </w:r>
     </w:p>
@@ -3097,6 +3165,7 @@
         </w:numPr>
       </w:pPr>
       <w:r>
+        <w:lastRenderedPageBreak/>
         <w:t>Objetivo (1–2 linhas)</w:t>
       </w:r>
     </w:p>
@@ -3217,7 +3286,6 @@
         <w:spacing w:before="240"/>
       </w:pPr>
       <w:r>
-        <w:lastRenderedPageBreak/>
         <w:t>“O que fiz na V1” (3–5 linhas)</w:t>
       </w:r>
     </w:p>
@@ -3865,6 +3933,7 @@
         <w:spacing w:before="240"/>
       </w:pPr>
       <w:r>
+        <w:lastRenderedPageBreak/>
         <w:t xml:space="preserve">Somente classes necessárias para os </w:t>
       </w:r>
       <w:r>
@@ -3976,7 +4045,6 @@
           <w:sz w:val="28"/>
           <w:szCs w:val="28"/>
         </w:rPr>
-        <w:lastRenderedPageBreak/>
         <w:t>Gate individual (V2) — obrigatório</w:t>
       </w:r>
     </w:p>
@@ -4256,6 +4324,7 @@
         <w:spacing w:after="240"/>
       </w:pPr>
       <w:r>
+        <w:lastRenderedPageBreak/>
         <w:t>Saída 3 …</w:t>
       </w:r>
     </w:p>
@@ -4329,7 +4398,6 @@
         <w:spacing w:before="240" w:after="240"/>
       </w:pPr>
       <w:r>
-        <w:lastRenderedPageBreak/>
         <w:t xml:space="preserve">IA pode ajudar, mas a avaliação considera: </w:t>
       </w:r>
       <w:r>

</xml_diff>

<commit_message>
Informado alteraçãões GustavaoGustavo Bormanieri
</commit_message>
<xml_diff>
--- a/Engenharia_de_Software/Trabalho_m1/DOCS_Gerais/templateprojeto.docx
+++ b/Engenharia_de_Software/Trabalho_m1/DOCS_Gerais/templateprojeto.docx
@@ -1,6 +1,6 @@
 
 <file path=word/document.xml><?xml version="1.0" encoding="utf-8"?>
-<w:document xmlns:wpc="http://schemas.microsoft.com/office/word/2010/wordprocessingCanvas" xmlns:cx="http://schemas.microsoft.com/office/drawing/2014/chartex" xmlns:mc="http://schemas.openxmlformats.org/markup-compatibility/2006" xmlns:o="urn:schemas-microsoft-com:office:office" xmlns:r="http://schemas.openxmlformats.org/officeDocument/2006/relationships" xmlns:m="http://schemas.openxmlformats.org/officeDocument/2006/math" xmlns:v="urn:schemas-microsoft-com:vml" xmlns:wp14="http://schemas.microsoft.com/office/word/2010/wordprocessingDrawing" xmlns:wp="http://schemas.openxmlformats.org/drawingml/2006/wordprocessingDrawing" xmlns:w10="urn:schemas-microsoft-com:office:word" xmlns:w="http://schemas.openxmlformats.org/wordprocessingml/2006/main" xmlns:w14="http://schemas.microsoft.com/office/word/2010/wordml" xmlns:w15="http://schemas.microsoft.com/office/word/2012/wordml" xmlns:w16se="http://schemas.microsoft.com/office/word/2015/wordml/symex" xmlns:wpg="http://schemas.microsoft.com/office/word/2010/wordprocessingGroup" xmlns:wpi="http://schemas.microsoft.com/office/word/2010/wordprocessingInk" xmlns:wne="http://schemas.microsoft.com/office/word/2006/wordml" xmlns:wps="http://schemas.microsoft.com/office/word/2010/wordprocessingShape" mc:Ignorable="w14 w15 w16se wp14">
+<w:document xmlns:wpc="http://schemas.microsoft.com/office/word/2010/wordprocessingCanvas" xmlns:cx="http://schemas.microsoft.com/office/drawing/2014/chartex" xmlns:cx1="http://schemas.microsoft.com/office/drawing/2015/9/8/chartex" xmlns:cx2="http://schemas.microsoft.com/office/drawing/2015/10/21/chartex" xmlns:cx3="http://schemas.microsoft.com/office/drawing/2016/5/9/chartex" xmlns:cx4="http://schemas.microsoft.com/office/drawing/2016/5/10/chartex" xmlns:cx5="http://schemas.microsoft.com/office/drawing/2016/5/11/chartex" xmlns:cx6="http://schemas.microsoft.com/office/drawing/2016/5/12/chartex" xmlns:cx7="http://schemas.microsoft.com/office/drawing/2016/5/13/chartex" xmlns:cx8="http://schemas.microsoft.com/office/drawing/2016/5/14/chartex" xmlns:mc="http://schemas.openxmlformats.org/markup-compatibility/2006" xmlns:aink="http://schemas.microsoft.com/office/drawing/2016/ink" xmlns:am3d="http://schemas.microsoft.com/office/drawing/2017/model3d" xmlns:o="urn:schemas-microsoft-com:office:office" xmlns:oel="http://schemas.microsoft.com/office/2019/extlst" xmlns:r="http://schemas.openxmlformats.org/officeDocument/2006/relationships" xmlns:m="http://schemas.openxmlformats.org/officeDocument/2006/math" xmlns:v="urn:schemas-microsoft-com:vml" xmlns:wp14="http://schemas.microsoft.com/office/word/2010/wordprocessingDrawing" xmlns:wp="http://schemas.openxmlformats.org/drawingml/2006/wordprocessingDrawing" xmlns:w10="urn:schemas-microsoft-com:office:word" xmlns:w="http://schemas.openxmlformats.org/wordprocessingml/2006/main" xmlns:w14="http://schemas.microsoft.com/office/word/2010/wordml" xmlns:w15="http://schemas.microsoft.com/office/word/2012/wordml" xmlns:w16cex="http://schemas.microsoft.com/office/word/2018/wordml/cex" xmlns:w16cid="http://schemas.microsoft.com/office/word/2016/wordml/cid" xmlns:w16="http://schemas.microsoft.com/office/word/2018/wordml" xmlns:w16du="http://schemas.microsoft.com/office/word/2023/wordml/word16du" xmlns:w16sdtdh="http://schemas.microsoft.com/office/word/2020/wordml/sdtdatahash" xmlns:w16sdtfl="http://schemas.microsoft.com/office/word/2024/wordml/sdtformatlock" xmlns:w16se="http://schemas.microsoft.com/office/word/2015/wordml/symex" xmlns:wpg="http://schemas.microsoft.com/office/word/2010/wordprocessingGroup" xmlns:wpi="http://schemas.microsoft.com/office/word/2010/wordprocessingInk" xmlns:wne="http://schemas.microsoft.com/office/word/2006/wordml" xmlns:wps="http://schemas.microsoft.com/office/word/2010/wordprocessingShape" mc:Ignorable="w14 w15 w16se w16cid w16 w16cex w16sdtdh w16sdtfl w16du wp14">
   <w:background w:color="FFFFFF"/>
   <w:body>
     <w:p>
@@ -547,16 +547,21 @@
           <w:numId w:val="4"/>
         </w:numPr>
         <w:spacing w:after="240"/>
+        <w:rPr>
+          <w:lang w:val="en-US"/>
+        </w:rPr>
       </w:pPr>
       <w:r>
         <w:rPr>
           <w:szCs w:val="20"/>
+          <w:lang w:val="en-US"/>
         </w:rPr>
         <w:t>Kauan David Leal -&gt;</w:t>
       </w:r>
       <w:r>
         <w:rPr>
           <w:szCs w:val="20"/>
+          <w:lang w:val="en-US"/>
         </w:rPr>
         <w:t xml:space="preserve"> </w:t>
       </w:r>
@@ -565,6 +570,7 @@
           <w:rPr>
             <w:rStyle w:val="Hyperlink"/>
             <w:szCs w:val="20"/>
+            <w:lang w:val="en-US"/>
           </w:rPr>
           <w:t>kauan.8301638@edu.univali.br</w:t>
         </w:r>
@@ -572,6 +578,7 @@
       <w:r>
         <w:rPr>
           <w:szCs w:val="20"/>
+          <w:lang w:val="en-US"/>
         </w:rPr>
         <w:t xml:space="preserve"> </w:t>
       </w:r>
@@ -592,6 +599,12 @@
       </w:r>
       <w:r>
         <w:t>–&gt;</w:t>
+      </w:r>
+      <w:r>
+        <w:t xml:space="preserve"> </w:t>
+      </w:r>
+      <w:r>
+        <w:t>gustavo.8286043@edu.univali.br</w:t>
       </w:r>
       <w:r>
         <w:br/>
@@ -762,8 +775,8 @@
       <w:tblGrid>
         <w:gridCol w:w="2475"/>
         <w:gridCol w:w="2051"/>
-        <w:gridCol w:w="1219"/>
-        <w:gridCol w:w="1425"/>
+        <w:gridCol w:w="1701"/>
+        <w:gridCol w:w="943"/>
         <w:gridCol w:w="2490"/>
       </w:tblGrid>
       <w:tr>
@@ -835,7 +848,7 @@
         </w:tc>
         <w:tc>
           <w:tcPr>
-            <w:tcW w:w="1219" w:type="dxa"/>
+            <w:tcW w:w="1701" w:type="dxa"/>
             <w:tcBorders>
               <w:top w:val="single" w:sz="8" w:space="0" w:color="000000"/>
               <w:left w:val="single" w:sz="8" w:space="0" w:color="000000"/>
@@ -866,7 +879,7 @@
         </w:tc>
         <w:tc>
           <w:tcPr>
-            <w:tcW w:w="1425" w:type="dxa"/>
+            <w:tcW w:w="943" w:type="dxa"/>
             <w:tcBorders>
               <w:top w:val="single" w:sz="8" w:space="0" w:color="000000"/>
               <w:left w:val="single" w:sz="8" w:space="0" w:color="000000"/>
@@ -986,7 +999,7 @@
         </w:tc>
         <w:tc>
           <w:tcPr>
-            <w:tcW w:w="1219" w:type="dxa"/>
+            <w:tcW w:w="1701" w:type="dxa"/>
             <w:tcBorders>
               <w:top w:val="single" w:sz="8" w:space="0" w:color="000000"/>
               <w:left w:val="single" w:sz="8" w:space="0" w:color="000000"/>
@@ -1013,7 +1026,7 @@
         </w:tc>
         <w:tc>
           <w:tcPr>
-            <w:tcW w:w="1425" w:type="dxa"/>
+            <w:tcW w:w="943" w:type="dxa"/>
             <w:tcBorders>
               <w:top w:val="single" w:sz="8" w:space="0" w:color="000000"/>
               <w:left w:val="single" w:sz="8" w:space="0" w:color="000000"/>
@@ -1150,7 +1163,7 @@
         </w:tc>
         <w:tc>
           <w:tcPr>
-            <w:tcW w:w="1219" w:type="dxa"/>
+            <w:tcW w:w="1701" w:type="dxa"/>
             <w:tcBorders>
               <w:top w:val="single" w:sz="8" w:space="0" w:color="000000"/>
               <w:left w:val="single" w:sz="8" w:space="0" w:color="000000"/>
@@ -1177,7 +1190,7 @@
         </w:tc>
         <w:tc>
           <w:tcPr>
-            <w:tcW w:w="1425" w:type="dxa"/>
+            <w:tcW w:w="943" w:type="dxa"/>
             <w:tcBorders>
               <w:top w:val="single" w:sz="8" w:space="0" w:color="000000"/>
               <w:left w:val="single" w:sz="8" w:space="0" w:color="000000"/>
@@ -1306,7 +1319,7 @@
         </w:tc>
         <w:tc>
           <w:tcPr>
-            <w:tcW w:w="1219" w:type="dxa"/>
+            <w:tcW w:w="1701" w:type="dxa"/>
             <w:tcBorders>
               <w:top w:val="single" w:sz="8" w:space="0" w:color="000000"/>
               <w:left w:val="single" w:sz="8" w:space="0" w:color="000000"/>
@@ -1333,7 +1346,7 @@
         </w:tc>
         <w:tc>
           <w:tcPr>
-            <w:tcW w:w="1425" w:type="dxa"/>
+            <w:tcW w:w="943" w:type="dxa"/>
             <w:tcBorders>
               <w:top w:val="single" w:sz="8" w:space="0" w:color="000000"/>
               <w:left w:val="single" w:sz="8" w:space="0" w:color="000000"/>
@@ -1468,7 +1481,7 @@
         </w:tc>
         <w:tc>
           <w:tcPr>
-            <w:tcW w:w="1219" w:type="dxa"/>
+            <w:tcW w:w="1701" w:type="dxa"/>
             <w:tcBorders>
               <w:top w:val="single" w:sz="8" w:space="0" w:color="000000"/>
               <w:left w:val="single" w:sz="8" w:space="0" w:color="000000"/>
@@ -1489,13 +1502,13 @@
               <w:jc w:val="center"/>
             </w:pPr>
             <w:r>
-              <w:t>Eduardo</w:t>
+              <w:t>Gustavo Bormani eri</w:t>
             </w:r>
           </w:p>
         </w:tc>
         <w:tc>
           <w:tcPr>
-            <w:tcW w:w="1425" w:type="dxa"/>
+            <w:tcW w:w="943" w:type="dxa"/>
             <w:tcBorders>
               <w:top w:val="single" w:sz="8" w:space="0" w:color="000000"/>
               <w:left w:val="single" w:sz="8" w:space="0" w:color="000000"/>
@@ -1632,7 +1645,7 @@
         </w:tc>
         <w:tc>
           <w:tcPr>
-            <w:tcW w:w="1219" w:type="dxa"/>
+            <w:tcW w:w="1701" w:type="dxa"/>
             <w:tcBorders>
               <w:top w:val="single" w:sz="8" w:space="0" w:color="000000"/>
               <w:left w:val="single" w:sz="8" w:space="0" w:color="000000"/>
@@ -1659,7 +1672,7 @@
         </w:tc>
         <w:tc>
           <w:tcPr>
-            <w:tcW w:w="1425" w:type="dxa"/>
+            <w:tcW w:w="943" w:type="dxa"/>
             <w:tcBorders>
               <w:top w:val="single" w:sz="8" w:space="0" w:color="000000"/>
               <w:left w:val="single" w:sz="8" w:space="0" w:color="000000"/>
@@ -1789,7 +1802,7 @@
         </w:tc>
         <w:tc>
           <w:tcPr>
-            <w:tcW w:w="1219" w:type="dxa"/>
+            <w:tcW w:w="1701" w:type="dxa"/>
             <w:tcBorders>
               <w:top w:val="single" w:sz="8" w:space="0" w:color="000000"/>
               <w:left w:val="single" w:sz="8" w:space="0" w:color="000000"/>
@@ -1816,7 +1829,7 @@
         </w:tc>
         <w:tc>
           <w:tcPr>
-            <w:tcW w:w="1425" w:type="dxa"/>
+            <w:tcW w:w="943" w:type="dxa"/>
             <w:tcBorders>
               <w:top w:val="single" w:sz="8" w:space="0" w:color="000000"/>
               <w:left w:val="single" w:sz="8" w:space="0" w:color="000000"/>
@@ -1939,13 +1952,13 @@
               <w:jc w:val="center"/>
             </w:pPr>
             <w:r>
-              <w:t>Eduardo Fabeni Johannsen</w:t>
+              <w:t>Gustavo Bormanieri</w:t>
             </w:r>
           </w:p>
         </w:tc>
         <w:tc>
           <w:tcPr>
-            <w:tcW w:w="1219" w:type="dxa"/>
+            <w:tcW w:w="1701" w:type="dxa"/>
             <w:tcBorders>
               <w:top w:val="single" w:sz="8" w:space="0" w:color="000000"/>
               <w:left w:val="single" w:sz="8" w:space="0" w:color="000000"/>
@@ -1968,13 +1981,11 @@
             <w:r>
               <w:t>Kauan</w:t>
             </w:r>
-            <w:bookmarkStart w:id="6" w:name="_GoBack"/>
-            <w:bookmarkEnd w:id="6"/>
-          </w:p>
-        </w:tc>
-        <w:tc>
-          <w:tcPr>
-            <w:tcW w:w="1425" w:type="dxa"/>
+          </w:p>
+        </w:tc>
+        <w:tc>
+          <w:tcPr>
+            <w:tcW w:w="943" w:type="dxa"/>
             <w:tcBorders>
               <w:top w:val="single" w:sz="8" w:space="0" w:color="000000"/>
               <w:left w:val="single" w:sz="8" w:space="0" w:color="000000"/>
@@ -2100,7 +2111,7 @@
         </w:tc>
         <w:tc>
           <w:tcPr>
-            <w:tcW w:w="1219" w:type="dxa"/>
+            <w:tcW w:w="1701" w:type="dxa"/>
             <w:tcBorders>
               <w:top w:val="single" w:sz="8" w:space="0" w:color="000000"/>
               <w:left w:val="single" w:sz="8" w:space="0" w:color="000000"/>
@@ -2124,7 +2135,7 @@
         </w:tc>
         <w:tc>
           <w:tcPr>
-            <w:tcW w:w="1425" w:type="dxa"/>
+            <w:tcW w:w="943" w:type="dxa"/>
             <w:tcBorders>
               <w:top w:val="single" w:sz="8" w:space="0" w:color="000000"/>
               <w:left w:val="single" w:sz="8" w:space="0" w:color="000000"/>
@@ -2227,7 +2238,7 @@
         </w:tc>
         <w:tc>
           <w:tcPr>
-            <w:tcW w:w="1219" w:type="dxa"/>
+            <w:tcW w:w="1701" w:type="dxa"/>
             <w:tcBorders>
               <w:top w:val="single" w:sz="8" w:space="0" w:color="000000"/>
               <w:left w:val="single" w:sz="8" w:space="0" w:color="000000"/>
@@ -2251,7 +2262,7 @@
         </w:tc>
         <w:tc>
           <w:tcPr>
-            <w:tcW w:w="1425" w:type="dxa"/>
+            <w:tcW w:w="943" w:type="dxa"/>
             <w:tcBorders>
               <w:top w:val="single" w:sz="8" w:space="0" w:color="000000"/>
               <w:left w:val="single" w:sz="8" w:space="0" w:color="000000"/>
@@ -2354,7 +2365,7 @@
         </w:tc>
         <w:tc>
           <w:tcPr>
-            <w:tcW w:w="1219" w:type="dxa"/>
+            <w:tcW w:w="1701" w:type="dxa"/>
             <w:tcBorders>
               <w:top w:val="single" w:sz="8" w:space="0" w:color="000000"/>
               <w:left w:val="single" w:sz="8" w:space="0" w:color="000000"/>
@@ -2378,7 +2389,7 @@
         </w:tc>
         <w:tc>
           <w:tcPr>
-            <w:tcW w:w="1425" w:type="dxa"/>
+            <w:tcW w:w="943" w:type="dxa"/>
             <w:tcBorders>
               <w:top w:val="single" w:sz="8" w:space="0" w:color="000000"/>
               <w:left w:val="single" w:sz="8" w:space="0" w:color="000000"/>
@@ -2481,7 +2492,7 @@
         </w:tc>
         <w:tc>
           <w:tcPr>
-            <w:tcW w:w="1219" w:type="dxa"/>
+            <w:tcW w:w="1701" w:type="dxa"/>
             <w:tcBorders>
               <w:top w:val="single" w:sz="8" w:space="0" w:color="000000"/>
               <w:left w:val="single" w:sz="8" w:space="0" w:color="000000"/>
@@ -2505,7 +2516,7 @@
         </w:tc>
         <w:tc>
           <w:tcPr>
-            <w:tcW w:w="1425" w:type="dxa"/>
+            <w:tcW w:w="943" w:type="dxa"/>
             <w:tcBorders>
               <w:top w:val="single" w:sz="8" w:space="0" w:color="000000"/>
               <w:left w:val="single" w:sz="8" w:space="0" w:color="000000"/>
@@ -2583,8 +2594,8 @@
           <w:szCs w:val="26"/>
         </w:rPr>
       </w:pPr>
-      <w:bookmarkStart w:id="7" w:name="_1ffa5q3f59y8" w:colFirst="0" w:colLast="0"/>
-      <w:bookmarkEnd w:id="7"/>
+      <w:bookmarkStart w:id="6" w:name="_1ffa5q3f59y8" w:colFirst="0" w:colLast="0"/>
+      <w:bookmarkEnd w:id="6"/>
       <w:r>
         <w:rPr>
           <w:b/>
@@ -2891,8 +2902,8 @@
           <w:szCs w:val="28"/>
         </w:rPr>
       </w:pPr>
-      <w:bookmarkStart w:id="8" w:name="_cj5srjojq7wv" w:colFirst="0" w:colLast="0"/>
-      <w:bookmarkEnd w:id="8"/>
+      <w:bookmarkStart w:id="7" w:name="_cj5srjojq7wv" w:colFirst="0" w:colLast="0"/>
+      <w:bookmarkEnd w:id="7"/>
       <w:r>
         <w:t>PARTE 1 — CONTEÚDO DA V1 (entrega inicial)</w:t>
       </w:r>
@@ -2903,48 +2914,48 @@
         <w:keepNext w:val="0"/>
         <w:keepLines w:val="0"/>
       </w:pPr>
-      <w:bookmarkStart w:id="9" w:name="_ow4v8fee3fe4" w:colFirst="0" w:colLast="0"/>
+      <w:bookmarkStart w:id="8" w:name="_ow4v8fee3fe4" w:colFirst="0" w:colLast="0"/>
+      <w:bookmarkEnd w:id="8"/>
+      <w:r>
+        <w:t>1. VISÃO GERAL (máx. 1 página)</w:t>
+      </w:r>
+    </w:p>
+    <w:p>
+      <w:pPr>
+        <w:pStyle w:val="Ttulo2"/>
+      </w:pPr>
+      <w:bookmarkStart w:id="9" w:name="_1c4vi9rg967t" w:colFirst="0" w:colLast="0"/>
       <w:bookmarkEnd w:id="9"/>
       <w:r>
-        <w:t>1. VISÃO GERAL (máx. 1 página)</w:t>
+        <w:t>1.1 Contexto e problema (6–10 linhas)</w:t>
       </w:r>
     </w:p>
     <w:p>
       <w:pPr>
         <w:pStyle w:val="Ttulo2"/>
       </w:pPr>
-      <w:bookmarkStart w:id="10" w:name="_1c4vi9rg967t" w:colFirst="0" w:colLast="0"/>
+      <w:bookmarkStart w:id="10" w:name="_s699v3jgi1bd" w:colFirst="0" w:colLast="0"/>
       <w:bookmarkEnd w:id="10"/>
       <w:r>
-        <w:t>1.1 Contexto e problema (6–10 linhas)</w:t>
+        <w:t>1.2 Objetivo do sistema (4–6 linhas)</w:t>
       </w:r>
     </w:p>
     <w:p>
       <w:pPr>
         <w:pStyle w:val="Ttulo2"/>
       </w:pPr>
-      <w:bookmarkStart w:id="11" w:name="_s699v3jgi1bd" w:colFirst="0" w:colLast="0"/>
+      <w:bookmarkStart w:id="11" w:name="_71sf9o5qnrck" w:colFirst="0" w:colLast="0"/>
       <w:bookmarkEnd w:id="11"/>
       <w:r>
-        <w:t>1.2 Objetivo do sistema (4–6 linhas)</w:t>
+        <w:t>1.3 Público-alvo e stakeholders</w:t>
       </w:r>
     </w:p>
     <w:p>
       <w:pPr>
         <w:pStyle w:val="Ttulo2"/>
       </w:pPr>
-      <w:bookmarkStart w:id="12" w:name="_71sf9o5qnrck" w:colFirst="0" w:colLast="0"/>
+      <w:bookmarkStart w:id="12" w:name="_axhcw316eu1t" w:colFirst="0" w:colLast="0"/>
       <w:bookmarkEnd w:id="12"/>
-      <w:r>
-        <w:t>1.3 Público-alvo e stakeholders</w:t>
-      </w:r>
-    </w:p>
-    <w:p>
-      <w:pPr>
-        <w:pStyle w:val="Ttulo2"/>
-      </w:pPr>
-      <w:bookmarkStart w:id="13" w:name="_axhcw316eu1t" w:colFirst="0" w:colLast="0"/>
-      <w:bookmarkEnd w:id="13"/>
       <w:r>
         <w:t>1.4 Escopo: inclui / não inclui</w:t>
       </w:r>
@@ -2955,8 +2966,8 @@
         <w:keepNext w:val="0"/>
         <w:keepLines w:val="0"/>
       </w:pPr>
-      <w:bookmarkStart w:id="14" w:name="_ys6exepeb6z9" w:colFirst="0" w:colLast="0"/>
-      <w:bookmarkEnd w:id="14"/>
+      <w:bookmarkStart w:id="13" w:name="_ys6exepeb6z9" w:colFirst="0" w:colLast="0"/>
+      <w:bookmarkEnd w:id="13"/>
       <w:r>
         <w:t>2. BPMN — PROCESSO PROPOSTO (“como deve ser”) (1 página)</w:t>
       </w:r>
@@ -3016,8 +3027,8 @@
         <w:keepNext w:val="0"/>
         <w:keepLines w:val="0"/>
       </w:pPr>
-      <w:bookmarkStart w:id="15" w:name="_svyn91klqn7g" w:colFirst="0" w:colLast="0"/>
-      <w:bookmarkEnd w:id="15"/>
+      <w:bookmarkStart w:id="14" w:name="_svyn91klqn7g" w:colFirst="0" w:colLast="0"/>
+      <w:bookmarkEnd w:id="14"/>
       <w:r>
         <w:t>3. REQUISITOS (máx. 2 páginas)</w:t>
       </w:r>
@@ -3028,8 +3039,8 @@
         <w:keepNext w:val="0"/>
         <w:keepLines w:val="0"/>
       </w:pPr>
-      <w:bookmarkStart w:id="16" w:name="_656pbtmwrgxa" w:colFirst="0" w:colLast="0"/>
-      <w:bookmarkEnd w:id="16"/>
+      <w:bookmarkStart w:id="15" w:name="_656pbtmwrgxa" w:colFirst="0" w:colLast="0"/>
+      <w:bookmarkEnd w:id="15"/>
       <w:r>
         <w:t>3.1 Requisitos Funcionais (RF) — 10 a 12 (testáveis)</w:t>
       </w:r>
@@ -3048,8 +3059,8 @@
         <w:keepNext w:val="0"/>
         <w:keepLines w:val="0"/>
       </w:pPr>
-      <w:bookmarkStart w:id="17" w:name="_qmldiq7pqgpa" w:colFirst="0" w:colLast="0"/>
-      <w:bookmarkEnd w:id="17"/>
+      <w:bookmarkStart w:id="16" w:name="_qmldiq7pqgpa" w:colFirst="0" w:colLast="0"/>
+      <w:bookmarkEnd w:id="16"/>
       <w:r>
         <w:t>3.2 Requisitos Não Funcionais (RNF) — 6 (inclui 1 acessibilidade)</w:t>
       </w:r>
@@ -3068,8 +3079,8 @@
         <w:keepNext w:val="0"/>
         <w:keepLines w:val="0"/>
       </w:pPr>
-      <w:bookmarkStart w:id="18" w:name="_o62vlyehbcbr" w:colFirst="0" w:colLast="0"/>
-      <w:bookmarkEnd w:id="18"/>
+      <w:bookmarkStart w:id="17" w:name="_o62vlyehbcbr" w:colFirst="0" w:colLast="0"/>
+      <w:bookmarkEnd w:id="17"/>
       <w:r>
         <w:t>3.3 Regras de negócio (RN) — 6 a 10</w:t>
       </w:r>
@@ -3089,8 +3100,8 @@
         <w:keepLines w:val="0"/>
         <w:ind w:left="720" w:hanging="360"/>
       </w:pPr>
-      <w:bookmarkStart w:id="19" w:name="_mat5lqmlm4e2" w:colFirst="0" w:colLast="0"/>
-      <w:bookmarkEnd w:id="19"/>
+      <w:bookmarkStart w:id="18" w:name="_mat5lqmlm4e2" w:colFirst="0" w:colLast="0"/>
+      <w:bookmarkEnd w:id="18"/>
       <w:r>
         <w:t>4. CASOS DE USO (V1)</w:t>
       </w:r>
@@ -3101,8 +3112,8 @@
         <w:keepNext w:val="0"/>
         <w:keepLines w:val="0"/>
       </w:pPr>
-      <w:bookmarkStart w:id="20" w:name="_y1vilklbtfdm" w:colFirst="0" w:colLast="0"/>
-      <w:bookmarkEnd w:id="20"/>
+      <w:bookmarkStart w:id="19" w:name="_y1vilklbtfdm" w:colFirst="0" w:colLast="0"/>
+      <w:bookmarkEnd w:id="19"/>
       <w:r>
         <w:t>4.1 Diagrama de casos de uso (1 página)</w:t>
       </w:r>
@@ -3121,8 +3132,8 @@
         <w:keepNext w:val="0"/>
         <w:keepLines w:val="0"/>
       </w:pPr>
-      <w:bookmarkStart w:id="21" w:name="_shwfi58e0sv4" w:colFirst="0" w:colLast="0"/>
-      <w:bookmarkEnd w:id="21"/>
+      <w:bookmarkStart w:id="20" w:name="_shwfi58e0sv4" w:colFirst="0" w:colLast="0"/>
+      <w:bookmarkEnd w:id="20"/>
       <w:r>
         <w:t>4.2 Especificação detalhada de 3 UCs (obrigatório)</w:t>
       </w:r>
@@ -3310,8 +3321,8 @@
           <w:color w:val="FF0000"/>
         </w:rPr>
       </w:pPr>
-      <w:bookmarkStart w:id="22" w:name="_xqb6qv53uzlb" w:colFirst="0" w:colLast="0"/>
-      <w:bookmarkEnd w:id="22"/>
+      <w:bookmarkStart w:id="21" w:name="_xqb6qv53uzlb" w:colFirst="0" w:colLast="0"/>
+      <w:bookmarkEnd w:id="21"/>
       <w:r>
         <w:rPr>
           <w:color w:val="FF0000"/>
@@ -3326,8 +3337,8 @@
         <w:keepLines w:val="0"/>
         <w:spacing w:before="360" w:after="80"/>
       </w:pPr>
-      <w:bookmarkStart w:id="23" w:name="_oj4dgr82r6gk" w:colFirst="0" w:colLast="0"/>
-      <w:bookmarkEnd w:id="23"/>
+      <w:bookmarkStart w:id="22" w:name="_oj4dgr82r6gk" w:colFirst="0" w:colLast="0"/>
+      <w:bookmarkEnd w:id="22"/>
       <w:r>
         <w:t>Cada aluno posta no AVA:</w:t>
       </w:r>
@@ -3410,8 +3421,8 @@
         <w:keepLines w:val="0"/>
         <w:spacing w:before="480" w:after="120"/>
       </w:pPr>
-      <w:bookmarkStart w:id="24" w:name="_oqqhf44feeit" w:colFirst="0" w:colLast="0"/>
-      <w:bookmarkEnd w:id="24"/>
+      <w:bookmarkStart w:id="23" w:name="_oqqhf44feeit" w:colFirst="0" w:colLast="0"/>
+      <w:bookmarkEnd w:id="23"/>
       <w:r>
         <w:t>PARTE 2 — ATUALIZAÇÃO NA V2 (revisão + acréscimos)</w:t>
       </w:r>
@@ -3448,8 +3459,8 @@
         <w:keepNext w:val="0"/>
         <w:keepLines w:val="0"/>
       </w:pPr>
-      <w:bookmarkStart w:id="25" w:name="_x595ltvu2ea0" w:colFirst="0" w:colLast="0"/>
-      <w:bookmarkEnd w:id="25"/>
+      <w:bookmarkStart w:id="24" w:name="_x595ltvu2ea0" w:colFirst="0" w:colLast="0"/>
+      <w:bookmarkEnd w:id="24"/>
       <w:r>
         <w:t>5. RASTREABILIDADE FINAL (V2) (1 página)</w:t>
       </w:r>
@@ -3923,8 +3934,8 @@
         <w:keepLines w:val="0"/>
         <w:ind w:left="720" w:hanging="360"/>
       </w:pPr>
-      <w:bookmarkStart w:id="26" w:name="_s8www2iipiz1" w:colFirst="0" w:colLast="0"/>
-      <w:bookmarkEnd w:id="26"/>
+      <w:bookmarkStart w:id="25" w:name="_s8www2iipiz1" w:colFirst="0" w:colLast="0"/>
+      <w:bookmarkEnd w:id="25"/>
       <w:r>
         <w:t>6. MODELO DE DOMÍNIO (V2) (1 página)</w:t>
       </w:r>
@@ -3944,8 +3955,8 @@
         <w:keepLines w:val="0"/>
         <w:ind w:left="720" w:hanging="360"/>
       </w:pPr>
-      <w:bookmarkStart w:id="27" w:name="_ul5s1ai4s1s9" w:colFirst="0" w:colLast="0"/>
-      <w:bookmarkEnd w:id="27"/>
+      <w:bookmarkStart w:id="26" w:name="_ul5s1ai4s1s9" w:colFirst="0" w:colLast="0"/>
+      <w:bookmarkEnd w:id="26"/>
       <w:r>
         <w:t>7. CLASSES DO RECORTE (V2) (1 página)</w:t>
       </w:r>
@@ -3999,8 +4010,8 @@
         <w:keepLines w:val="0"/>
         <w:ind w:left="720" w:hanging="360"/>
       </w:pPr>
-      <w:bookmarkStart w:id="28" w:name="_9bex1ltrwao1" w:colFirst="0" w:colLast="0"/>
-      <w:bookmarkEnd w:id="28"/>
+      <w:bookmarkStart w:id="27" w:name="_9bex1ltrwao1" w:colFirst="0" w:colLast="0"/>
+      <w:bookmarkEnd w:id="27"/>
       <w:r>
         <w:t>8. PROTÓTIPO (V2) (1 página)</w:t>
       </w:r>
@@ -4062,8 +4073,8 @@
           <w:szCs w:val="34"/>
         </w:rPr>
       </w:pPr>
-      <w:bookmarkStart w:id="29" w:name="_wp2yddq9q5of" w:colFirst="0" w:colLast="0"/>
-      <w:bookmarkEnd w:id="29"/>
+      <w:bookmarkStart w:id="28" w:name="_wp2yddq9q5of" w:colFirst="0" w:colLast="0"/>
+      <w:bookmarkEnd w:id="28"/>
       <w:r>
         <w:rPr>
           <w:color w:val="FF0000"/>
@@ -4159,8 +4170,8 @@
         <w:keepLines w:val="0"/>
         <w:spacing w:before="480" w:after="120"/>
       </w:pPr>
-      <w:bookmarkStart w:id="30" w:name="_y9aitaiykbxz" w:colFirst="0" w:colLast="0"/>
-      <w:bookmarkEnd w:id="30"/>
+      <w:bookmarkStart w:id="29" w:name="_y9aitaiykbxz" w:colFirst="0" w:colLast="0"/>
+      <w:bookmarkEnd w:id="29"/>
       <w:r>
         <w:t>ANEXO A — REGISTRO DE USO DE IA (obrigatório quando IA for usada)</w:t>
       </w:r>
@@ -4186,8 +4197,8 @@
         <w:keepNext w:val="0"/>
         <w:keepLines w:val="0"/>
       </w:pPr>
-      <w:bookmarkStart w:id="31" w:name="_hjf5cujefbbc" w:colFirst="0" w:colLast="0"/>
-      <w:bookmarkEnd w:id="31"/>
+      <w:bookmarkStart w:id="30" w:name="_hjf5cujefbbc" w:colFirst="0" w:colLast="0"/>
+      <w:bookmarkEnd w:id="30"/>
       <w:r>
         <w:t>A1. Ferramenta(s)</w:t>
       </w:r>
@@ -4212,8 +4223,8 @@
         <w:keepNext w:val="0"/>
         <w:keepLines w:val="0"/>
       </w:pPr>
-      <w:bookmarkStart w:id="32" w:name="_rr50q9gsb0cv" w:colFirst="0" w:colLast="0"/>
-      <w:bookmarkEnd w:id="32"/>
+      <w:bookmarkStart w:id="31" w:name="_rr50q9gsb0cv" w:colFirst="0" w:colLast="0"/>
+      <w:bookmarkEnd w:id="31"/>
       <w:r>
         <w:t>A2. Onde a IA foi usada (marcar)</w:t>
       </w:r>
@@ -4240,8 +4251,8 @@
         <w:keepNext w:val="0"/>
         <w:keepLines w:val="0"/>
       </w:pPr>
-      <w:bookmarkStart w:id="33" w:name="_5m145n5isjnt" w:colFirst="0" w:colLast="0"/>
-      <w:bookmarkEnd w:id="33"/>
+      <w:bookmarkStart w:id="32" w:name="_5m145n5isjnt" w:colFirst="0" w:colLast="0"/>
+      <w:bookmarkEnd w:id="32"/>
       <w:r>
         <w:t>A3. Três prompts principais (copiar e colar)</w:t>
       </w:r>
@@ -4288,8 +4299,8 @@
         <w:keepNext w:val="0"/>
         <w:keepLines w:val="0"/>
       </w:pPr>
-      <w:bookmarkStart w:id="34" w:name="_mkge0780pr0d" w:colFirst="0" w:colLast="0"/>
-      <w:bookmarkEnd w:id="34"/>
+      <w:bookmarkStart w:id="33" w:name="_mkge0780pr0d" w:colFirst="0" w:colLast="0"/>
+      <w:bookmarkEnd w:id="33"/>
       <w:r>
         <w:t>A4. Trecho de saída (máx. 5 linhas) + decisão do grupo</w:t>
       </w:r>
@@ -4343,8 +4354,8 @@
         <w:keepNext w:val="0"/>
         <w:keepLines w:val="0"/>
       </w:pPr>
-      <w:bookmarkStart w:id="35" w:name="_9drqpxj4djpl" w:colFirst="0" w:colLast="0"/>
-      <w:bookmarkEnd w:id="35"/>
+      <w:bookmarkStart w:id="34" w:name="_9drqpxj4djpl" w:colFirst="0" w:colLast="0"/>
+      <w:bookmarkEnd w:id="34"/>
       <w:r>
         <w:t>A5. Evidência de revisão humana (obrigatório)</w:t>
       </w:r>
@@ -4392,8 +4403,8 @@
           <w:szCs w:val="28"/>
         </w:rPr>
       </w:pPr>
-      <w:bookmarkStart w:id="36" w:name="_o6d6iglhvzru" w:colFirst="0" w:colLast="0"/>
-      <w:bookmarkEnd w:id="36"/>
+      <w:bookmarkStart w:id="35" w:name="_o6d6iglhvzru" w:colFirst="0" w:colLast="0"/>
+      <w:bookmarkEnd w:id="35"/>
       <w:r>
         <w:rPr>
           <w:sz w:val="28"/>
@@ -4443,7 +4454,7 @@
 </file>
 
 <file path=word/endnotes.xml><?xml version="1.0" encoding="utf-8"?>
-<w:endnotes xmlns:wpc="http://schemas.microsoft.com/office/word/2010/wordprocessingCanvas" xmlns:cx="http://schemas.microsoft.com/office/drawing/2014/chartex" xmlns:mc="http://schemas.openxmlformats.org/markup-compatibility/2006" xmlns:o="urn:schemas-microsoft-com:office:office" xmlns:r="http://schemas.openxmlformats.org/officeDocument/2006/relationships" xmlns:m="http://schemas.openxmlformats.org/officeDocument/2006/math" xmlns:v="urn:schemas-microsoft-com:vml" xmlns:wp14="http://schemas.microsoft.com/office/word/2010/wordprocessingDrawing" xmlns:wp="http://schemas.openxmlformats.org/drawingml/2006/wordprocessingDrawing" xmlns:w10="urn:schemas-microsoft-com:office:word" xmlns:w="http://schemas.openxmlformats.org/wordprocessingml/2006/main" xmlns:w14="http://schemas.microsoft.com/office/word/2010/wordml" xmlns:w15="http://schemas.microsoft.com/office/word/2012/wordml" xmlns:w16se="http://schemas.microsoft.com/office/word/2015/wordml/symex" xmlns:wpg="http://schemas.microsoft.com/office/word/2010/wordprocessingGroup" xmlns:wpi="http://schemas.microsoft.com/office/word/2010/wordprocessingInk" xmlns:wne="http://schemas.microsoft.com/office/word/2006/wordml" xmlns:wps="http://schemas.microsoft.com/office/word/2010/wordprocessingShape" mc:Ignorable="w14 w15 w16se wp14">
+<w:endnotes xmlns:wpc="http://schemas.microsoft.com/office/word/2010/wordprocessingCanvas" xmlns:cx="http://schemas.microsoft.com/office/drawing/2014/chartex" xmlns:cx1="http://schemas.microsoft.com/office/drawing/2015/9/8/chartex" xmlns:cx2="http://schemas.microsoft.com/office/drawing/2015/10/21/chartex" xmlns:cx3="http://schemas.microsoft.com/office/drawing/2016/5/9/chartex" xmlns:cx4="http://schemas.microsoft.com/office/drawing/2016/5/10/chartex" xmlns:cx5="http://schemas.microsoft.com/office/drawing/2016/5/11/chartex" xmlns:cx6="http://schemas.microsoft.com/office/drawing/2016/5/12/chartex" xmlns:cx7="http://schemas.microsoft.com/office/drawing/2016/5/13/chartex" xmlns:cx8="http://schemas.microsoft.com/office/drawing/2016/5/14/chartex" xmlns:mc="http://schemas.openxmlformats.org/markup-compatibility/2006" xmlns:aink="http://schemas.microsoft.com/office/drawing/2016/ink" xmlns:am3d="http://schemas.microsoft.com/office/drawing/2017/model3d" xmlns:o="urn:schemas-microsoft-com:office:office" xmlns:oel="http://schemas.microsoft.com/office/2019/extlst" xmlns:r="http://schemas.openxmlformats.org/officeDocument/2006/relationships" xmlns:m="http://schemas.openxmlformats.org/officeDocument/2006/math" xmlns:v="urn:schemas-microsoft-com:vml" xmlns:wp14="http://schemas.microsoft.com/office/word/2010/wordprocessingDrawing" xmlns:wp="http://schemas.openxmlformats.org/drawingml/2006/wordprocessingDrawing" xmlns:w10="urn:schemas-microsoft-com:office:word" xmlns:w="http://schemas.openxmlformats.org/wordprocessingml/2006/main" xmlns:w14="http://schemas.microsoft.com/office/word/2010/wordml" xmlns:w15="http://schemas.microsoft.com/office/word/2012/wordml" xmlns:w16cex="http://schemas.microsoft.com/office/word/2018/wordml/cex" xmlns:w16cid="http://schemas.microsoft.com/office/word/2016/wordml/cid" xmlns:w16="http://schemas.microsoft.com/office/word/2018/wordml" xmlns:w16du="http://schemas.microsoft.com/office/word/2023/wordml/word16du" xmlns:w16sdtdh="http://schemas.microsoft.com/office/word/2020/wordml/sdtdatahash" xmlns:w16sdtfl="http://schemas.microsoft.com/office/word/2024/wordml/sdtformatlock" xmlns:w16se="http://schemas.microsoft.com/office/word/2015/wordml/symex" xmlns:wpg="http://schemas.microsoft.com/office/word/2010/wordprocessingGroup" xmlns:wpi="http://schemas.microsoft.com/office/word/2010/wordprocessingInk" xmlns:wne="http://schemas.microsoft.com/office/word/2006/wordml" xmlns:wps="http://schemas.microsoft.com/office/word/2010/wordprocessingShape" mc:Ignorable="w14 w15 w16se w16cid w16 w16cex w16sdtdh w16sdtfl w16du wp14">
   <w:endnote w:type="separator" w:id="-1">
     <w:p>
       <w:pPr>
@@ -4468,7 +4479,7 @@
 </file>
 
 <file path=word/footer1.xml><?xml version="1.0" encoding="utf-8"?>
-<w:ftr xmlns:wpc="http://schemas.microsoft.com/office/word/2010/wordprocessingCanvas" xmlns:cx="http://schemas.microsoft.com/office/drawing/2014/chartex" xmlns:mc="http://schemas.openxmlformats.org/markup-compatibility/2006" xmlns:o="urn:schemas-microsoft-com:office:office" xmlns:r="http://schemas.openxmlformats.org/officeDocument/2006/relationships" xmlns:m="http://schemas.openxmlformats.org/officeDocument/2006/math" xmlns:v="urn:schemas-microsoft-com:vml" xmlns:wp14="http://schemas.microsoft.com/office/word/2010/wordprocessingDrawing" xmlns:wp="http://schemas.openxmlformats.org/drawingml/2006/wordprocessingDrawing" xmlns:w10="urn:schemas-microsoft-com:office:word" xmlns:w="http://schemas.openxmlformats.org/wordprocessingml/2006/main" xmlns:w14="http://schemas.microsoft.com/office/word/2010/wordml" xmlns:w15="http://schemas.microsoft.com/office/word/2012/wordml" xmlns:w16se="http://schemas.microsoft.com/office/word/2015/wordml/symex" xmlns:wpg="http://schemas.microsoft.com/office/word/2010/wordprocessingGroup" xmlns:wpi="http://schemas.microsoft.com/office/word/2010/wordprocessingInk" xmlns:wne="http://schemas.microsoft.com/office/word/2006/wordml" xmlns:wps="http://schemas.microsoft.com/office/word/2010/wordprocessingShape" mc:Ignorable="w14 w15 w16se wp14">
+<w:ftr xmlns:wpc="http://schemas.microsoft.com/office/word/2010/wordprocessingCanvas" xmlns:cx="http://schemas.microsoft.com/office/drawing/2014/chartex" xmlns:cx1="http://schemas.microsoft.com/office/drawing/2015/9/8/chartex" xmlns:cx2="http://schemas.microsoft.com/office/drawing/2015/10/21/chartex" xmlns:cx3="http://schemas.microsoft.com/office/drawing/2016/5/9/chartex" xmlns:cx4="http://schemas.microsoft.com/office/drawing/2016/5/10/chartex" xmlns:cx5="http://schemas.microsoft.com/office/drawing/2016/5/11/chartex" xmlns:cx6="http://schemas.microsoft.com/office/drawing/2016/5/12/chartex" xmlns:cx7="http://schemas.microsoft.com/office/drawing/2016/5/13/chartex" xmlns:cx8="http://schemas.microsoft.com/office/drawing/2016/5/14/chartex" xmlns:mc="http://schemas.openxmlformats.org/markup-compatibility/2006" xmlns:aink="http://schemas.microsoft.com/office/drawing/2016/ink" xmlns:am3d="http://schemas.microsoft.com/office/drawing/2017/model3d" xmlns:o="urn:schemas-microsoft-com:office:office" xmlns:oel="http://schemas.microsoft.com/office/2019/extlst" xmlns:r="http://schemas.openxmlformats.org/officeDocument/2006/relationships" xmlns:m="http://schemas.openxmlformats.org/officeDocument/2006/math" xmlns:v="urn:schemas-microsoft-com:vml" xmlns:wp14="http://schemas.microsoft.com/office/word/2010/wordprocessingDrawing" xmlns:wp="http://schemas.openxmlformats.org/drawingml/2006/wordprocessingDrawing" xmlns:w10="urn:schemas-microsoft-com:office:word" xmlns:w="http://schemas.openxmlformats.org/wordprocessingml/2006/main" xmlns:w14="http://schemas.microsoft.com/office/word/2010/wordml" xmlns:w15="http://schemas.microsoft.com/office/word/2012/wordml" xmlns:w16cex="http://schemas.microsoft.com/office/word/2018/wordml/cex" xmlns:w16cid="http://schemas.microsoft.com/office/word/2016/wordml/cid" xmlns:w16="http://schemas.microsoft.com/office/word/2018/wordml" xmlns:w16du="http://schemas.microsoft.com/office/word/2023/wordml/word16du" xmlns:w16sdtdh="http://schemas.microsoft.com/office/word/2020/wordml/sdtdatahash" xmlns:w16sdtfl="http://schemas.microsoft.com/office/word/2024/wordml/sdtformatlock" xmlns:w16se="http://schemas.microsoft.com/office/word/2015/wordml/symex" xmlns:wpg="http://schemas.microsoft.com/office/word/2010/wordprocessingGroup" xmlns:wpi="http://schemas.microsoft.com/office/word/2010/wordprocessingInk" xmlns:wne="http://schemas.microsoft.com/office/word/2006/wordml" xmlns:wps="http://schemas.microsoft.com/office/word/2010/wordprocessingShape" mc:Ignorable="w14 w15 w16se w16cid w16 w16cex w16sdtdh w16sdtfl w16du wp14">
   <w:p>
     <w:pPr>
       <w:pBdr>
@@ -4484,7 +4495,7 @@
 </file>
 
 <file path=word/footnotes.xml><?xml version="1.0" encoding="utf-8"?>
-<w:footnotes xmlns:wpc="http://schemas.microsoft.com/office/word/2010/wordprocessingCanvas" xmlns:cx="http://schemas.microsoft.com/office/drawing/2014/chartex" xmlns:mc="http://schemas.openxmlformats.org/markup-compatibility/2006" xmlns:o="urn:schemas-microsoft-com:office:office" xmlns:r="http://schemas.openxmlformats.org/officeDocument/2006/relationships" xmlns:m="http://schemas.openxmlformats.org/officeDocument/2006/math" xmlns:v="urn:schemas-microsoft-com:vml" xmlns:wp14="http://schemas.microsoft.com/office/word/2010/wordprocessingDrawing" xmlns:wp="http://schemas.openxmlformats.org/drawingml/2006/wordprocessingDrawing" xmlns:w10="urn:schemas-microsoft-com:office:word" xmlns:w="http://schemas.openxmlformats.org/wordprocessingml/2006/main" xmlns:w14="http://schemas.microsoft.com/office/word/2010/wordml" xmlns:w15="http://schemas.microsoft.com/office/word/2012/wordml" xmlns:w16se="http://schemas.microsoft.com/office/word/2015/wordml/symex" xmlns:wpg="http://schemas.microsoft.com/office/word/2010/wordprocessingGroup" xmlns:wpi="http://schemas.microsoft.com/office/word/2010/wordprocessingInk" xmlns:wne="http://schemas.microsoft.com/office/word/2006/wordml" xmlns:wps="http://schemas.microsoft.com/office/word/2010/wordprocessingShape" mc:Ignorable="w14 w15 w16se wp14">
+<w:footnotes xmlns:wpc="http://schemas.microsoft.com/office/word/2010/wordprocessingCanvas" xmlns:cx="http://schemas.microsoft.com/office/drawing/2014/chartex" xmlns:cx1="http://schemas.microsoft.com/office/drawing/2015/9/8/chartex" xmlns:cx2="http://schemas.microsoft.com/office/drawing/2015/10/21/chartex" xmlns:cx3="http://schemas.microsoft.com/office/drawing/2016/5/9/chartex" xmlns:cx4="http://schemas.microsoft.com/office/drawing/2016/5/10/chartex" xmlns:cx5="http://schemas.microsoft.com/office/drawing/2016/5/11/chartex" xmlns:cx6="http://schemas.microsoft.com/office/drawing/2016/5/12/chartex" xmlns:cx7="http://schemas.microsoft.com/office/drawing/2016/5/13/chartex" xmlns:cx8="http://schemas.microsoft.com/office/drawing/2016/5/14/chartex" xmlns:mc="http://schemas.openxmlformats.org/markup-compatibility/2006" xmlns:aink="http://schemas.microsoft.com/office/drawing/2016/ink" xmlns:am3d="http://schemas.microsoft.com/office/drawing/2017/model3d" xmlns:o="urn:schemas-microsoft-com:office:office" xmlns:oel="http://schemas.microsoft.com/office/2019/extlst" xmlns:r="http://schemas.openxmlformats.org/officeDocument/2006/relationships" xmlns:m="http://schemas.openxmlformats.org/officeDocument/2006/math" xmlns:v="urn:schemas-microsoft-com:vml" xmlns:wp14="http://schemas.microsoft.com/office/word/2010/wordprocessingDrawing" xmlns:wp="http://schemas.openxmlformats.org/drawingml/2006/wordprocessingDrawing" xmlns:w10="urn:schemas-microsoft-com:office:word" xmlns:w="http://schemas.openxmlformats.org/wordprocessingml/2006/main" xmlns:w14="http://schemas.microsoft.com/office/word/2010/wordml" xmlns:w15="http://schemas.microsoft.com/office/word/2012/wordml" xmlns:w16cex="http://schemas.microsoft.com/office/word/2018/wordml/cex" xmlns:w16cid="http://schemas.microsoft.com/office/word/2016/wordml/cid" xmlns:w16="http://schemas.microsoft.com/office/word/2018/wordml" xmlns:w16du="http://schemas.microsoft.com/office/word/2023/wordml/word16du" xmlns:w16sdtdh="http://schemas.microsoft.com/office/word/2020/wordml/sdtdatahash" xmlns:w16sdtfl="http://schemas.microsoft.com/office/word/2024/wordml/sdtformatlock" xmlns:w16se="http://schemas.microsoft.com/office/word/2015/wordml/symex" xmlns:wpg="http://schemas.microsoft.com/office/word/2010/wordprocessingGroup" xmlns:wpi="http://schemas.microsoft.com/office/word/2010/wordprocessingInk" xmlns:wne="http://schemas.microsoft.com/office/word/2006/wordml" xmlns:wps="http://schemas.microsoft.com/office/word/2010/wordprocessingShape" mc:Ignorable="w14 w15 w16se w16cid w16 w16cex w16sdtdh w16sdtfl w16du wp14">
   <w:footnote w:type="separator" w:id="-1">
     <w:p>
       <w:pPr>
@@ -4509,7 +4520,7 @@
 </file>
 
 <file path=word/numbering.xml><?xml version="1.0" encoding="utf-8"?>
-<w:numbering xmlns:wpc="http://schemas.microsoft.com/office/word/2010/wordprocessingCanvas" xmlns:cx="http://schemas.microsoft.com/office/drawing/2014/chartex" xmlns:mc="http://schemas.openxmlformats.org/markup-compatibility/2006" xmlns:o="urn:schemas-microsoft-com:office:office" xmlns:r="http://schemas.openxmlformats.org/officeDocument/2006/relationships" xmlns:m="http://schemas.openxmlformats.org/officeDocument/2006/math" xmlns:v="urn:schemas-microsoft-com:vml" xmlns:wp14="http://schemas.microsoft.com/office/word/2010/wordprocessingDrawing" xmlns:wp="http://schemas.openxmlformats.org/drawingml/2006/wordprocessingDrawing" xmlns:w10="urn:schemas-microsoft-com:office:word" xmlns:w="http://schemas.openxmlformats.org/wordprocessingml/2006/main" xmlns:w14="http://schemas.microsoft.com/office/word/2010/wordml" xmlns:w15="http://schemas.microsoft.com/office/word/2012/wordml" xmlns:w16se="http://schemas.microsoft.com/office/word/2015/wordml/symex" xmlns:wpg="http://schemas.microsoft.com/office/word/2010/wordprocessingGroup" xmlns:wpi="http://schemas.microsoft.com/office/word/2010/wordprocessingInk" xmlns:wne="http://schemas.microsoft.com/office/word/2006/wordml" xmlns:wps="http://schemas.microsoft.com/office/word/2010/wordprocessingShape" mc:Ignorable="w14 w15 w16se wp14">
+<w:numbering xmlns:wpc="http://schemas.microsoft.com/office/word/2010/wordprocessingCanvas" xmlns:cx="http://schemas.microsoft.com/office/drawing/2014/chartex" xmlns:cx1="http://schemas.microsoft.com/office/drawing/2015/9/8/chartex" xmlns:cx2="http://schemas.microsoft.com/office/drawing/2015/10/21/chartex" xmlns:cx3="http://schemas.microsoft.com/office/drawing/2016/5/9/chartex" xmlns:cx4="http://schemas.microsoft.com/office/drawing/2016/5/10/chartex" xmlns:cx5="http://schemas.microsoft.com/office/drawing/2016/5/11/chartex" xmlns:cx6="http://schemas.microsoft.com/office/drawing/2016/5/12/chartex" xmlns:cx7="http://schemas.microsoft.com/office/drawing/2016/5/13/chartex" xmlns:cx8="http://schemas.microsoft.com/office/drawing/2016/5/14/chartex" xmlns:mc="http://schemas.openxmlformats.org/markup-compatibility/2006" xmlns:aink="http://schemas.microsoft.com/office/drawing/2016/ink" xmlns:am3d="http://schemas.microsoft.com/office/drawing/2017/model3d" xmlns:o="urn:schemas-microsoft-com:office:office" xmlns:oel="http://schemas.microsoft.com/office/2019/extlst" xmlns:r="http://schemas.openxmlformats.org/officeDocument/2006/relationships" xmlns:m="http://schemas.openxmlformats.org/officeDocument/2006/math" xmlns:v="urn:schemas-microsoft-com:vml" xmlns:wp14="http://schemas.microsoft.com/office/word/2010/wordprocessingDrawing" xmlns:wp="http://schemas.openxmlformats.org/drawingml/2006/wordprocessingDrawing" xmlns:w10="urn:schemas-microsoft-com:office:word" xmlns:w="http://schemas.openxmlformats.org/wordprocessingml/2006/main" xmlns:w14="http://schemas.microsoft.com/office/word/2010/wordml" xmlns:w15="http://schemas.microsoft.com/office/word/2012/wordml" xmlns:w16cex="http://schemas.microsoft.com/office/word/2018/wordml/cex" xmlns:w16cid="http://schemas.microsoft.com/office/word/2016/wordml/cid" xmlns:w16="http://schemas.microsoft.com/office/word/2018/wordml" xmlns:w16du="http://schemas.microsoft.com/office/word/2023/wordml/word16du" xmlns:w16sdtdh="http://schemas.microsoft.com/office/word/2020/wordml/sdtdatahash" xmlns:w16sdtfl="http://schemas.microsoft.com/office/word/2024/wordml/sdtformatlock" xmlns:w16se="http://schemas.microsoft.com/office/word/2015/wordml/symex" xmlns:wpg="http://schemas.microsoft.com/office/word/2010/wordprocessingGroup" xmlns:wpi="http://schemas.microsoft.com/office/word/2010/wordprocessingInk" xmlns:wne="http://schemas.microsoft.com/office/word/2006/wordml" xmlns:wps="http://schemas.microsoft.com/office/word/2010/wordprocessingShape" mc:Ignorable="w14 w15 w16se w16cid w16 w16cex w16sdtdh w16sdtfl w16du wp14">
   <w:abstractNum w:abstractNumId="0" w15:restartNumberingAfterBreak="0">
     <w:nsid w:val="04247767"/>
     <w:multiLevelType w:val="multilevel"/>
@@ -6092,53 +6103,53 @@
       </w:rPr>
     </w:lvl>
   </w:abstractNum>
-  <w:num w:numId="1">
+  <w:num w:numId="1" w16cid:durableId="1638756730">
     <w:abstractNumId w:val="8"/>
   </w:num>
-  <w:num w:numId="2">
+  <w:num w:numId="2" w16cid:durableId="1286959303">
     <w:abstractNumId w:val="0"/>
   </w:num>
-  <w:num w:numId="3">
+  <w:num w:numId="3" w16cid:durableId="1429619973">
     <w:abstractNumId w:val="7"/>
   </w:num>
-  <w:num w:numId="4">
+  <w:num w:numId="4" w16cid:durableId="2082868192">
     <w:abstractNumId w:val="10"/>
   </w:num>
-  <w:num w:numId="5">
+  <w:num w:numId="5" w16cid:durableId="152962545">
     <w:abstractNumId w:val="3"/>
   </w:num>
-  <w:num w:numId="6">
+  <w:num w:numId="6" w16cid:durableId="1579515313">
     <w:abstractNumId w:val="2"/>
   </w:num>
-  <w:num w:numId="7">
+  <w:num w:numId="7" w16cid:durableId="1849440454">
     <w:abstractNumId w:val="4"/>
   </w:num>
-  <w:num w:numId="8">
+  <w:num w:numId="8" w16cid:durableId="1510177739">
     <w:abstractNumId w:val="9"/>
   </w:num>
-  <w:num w:numId="9">
+  <w:num w:numId="9" w16cid:durableId="1393192202">
     <w:abstractNumId w:val="1"/>
   </w:num>
-  <w:num w:numId="10">
+  <w:num w:numId="10" w16cid:durableId="703940642">
     <w:abstractNumId w:val="13"/>
   </w:num>
-  <w:num w:numId="11">
+  <w:num w:numId="11" w16cid:durableId="15734121">
     <w:abstractNumId w:val="11"/>
   </w:num>
-  <w:num w:numId="12">
+  <w:num w:numId="12" w16cid:durableId="556361485">
     <w:abstractNumId w:val="6"/>
   </w:num>
-  <w:num w:numId="13">
+  <w:num w:numId="13" w16cid:durableId="1602373603">
     <w:abstractNumId w:val="12"/>
   </w:num>
-  <w:num w:numId="14">
+  <w:num w:numId="14" w16cid:durableId="1273395730">
     <w:abstractNumId w:val="5"/>
   </w:num>
 </w:numbering>
 </file>
 
 <file path=word/styles.xml><?xml version="1.0" encoding="utf-8"?>
-<w:styles xmlns:mc="http://schemas.openxmlformats.org/markup-compatibility/2006" xmlns:r="http://schemas.openxmlformats.org/officeDocument/2006/relationships" xmlns:w="http://schemas.openxmlformats.org/wordprocessingml/2006/main" xmlns:w14="http://schemas.microsoft.com/office/word/2010/wordml" xmlns:w15="http://schemas.microsoft.com/office/word/2012/wordml" xmlns:w16se="http://schemas.microsoft.com/office/word/2015/wordml/symex" mc:Ignorable="w14 w15 w16se">
+<w:styles xmlns:mc="http://schemas.openxmlformats.org/markup-compatibility/2006" xmlns:r="http://schemas.openxmlformats.org/officeDocument/2006/relationships" xmlns:w="http://schemas.openxmlformats.org/wordprocessingml/2006/main" xmlns:w14="http://schemas.microsoft.com/office/word/2010/wordml" xmlns:w15="http://schemas.microsoft.com/office/word/2012/wordml" xmlns:w16cex="http://schemas.microsoft.com/office/word/2018/wordml/cex" xmlns:w16cid="http://schemas.microsoft.com/office/word/2016/wordml/cid" xmlns:w16="http://schemas.microsoft.com/office/word/2018/wordml" xmlns:w16du="http://schemas.microsoft.com/office/word/2023/wordml/word16du" xmlns:w16sdtdh="http://schemas.microsoft.com/office/word/2020/wordml/sdtdatahash" xmlns:w16sdtfl="http://schemas.microsoft.com/office/word/2024/wordml/sdtformatlock" xmlns:w16se="http://schemas.microsoft.com/office/word/2015/wordml/symex" mc:Ignorable="w14 w15 w16se w16cid w16 w16cex w16sdtdh w16sdtfl w16du">
   <w:docDefaults>
     <w:rPrDefault>
       <w:rPr>
@@ -6154,7 +6165,7 @@
       </w:pPr>
     </w:pPrDefault>
   </w:docDefaults>
-  <w:latentStyles w:defLockedState="0" w:defUIPriority="99" w:defSemiHidden="0" w:defUnhideWhenUsed="0" w:defQFormat="0" w:count="371">
+  <w:latentStyles w:defLockedState="0" w:defUIPriority="99" w:defSemiHidden="0" w:defUnhideWhenUsed="0" w:defQFormat="0" w:count="376">
     <w:lsdException w:name="Normal" w:uiPriority="0" w:qFormat="1"/>
     <w:lsdException w:name="heading 1" w:uiPriority="9" w:qFormat="1"/>
     <w:lsdException w:name="heading 2" w:semiHidden="1" w:uiPriority="9" w:unhideWhenUsed="1" w:qFormat="1"/>
@@ -6526,6 +6537,11 @@
     <w:lsdException w:name="List Table 5 Dark Accent 6" w:uiPriority="50"/>
     <w:lsdException w:name="List Table 6 Colorful Accent 6" w:uiPriority="51"/>
     <w:lsdException w:name="List Table 7 Colorful Accent 6" w:uiPriority="52"/>
+    <w:lsdException w:name="Mention" w:semiHidden="1" w:unhideWhenUsed="1"/>
+    <w:lsdException w:name="Smart Hyperlink" w:semiHidden="1" w:unhideWhenUsed="1"/>
+    <w:lsdException w:name="Hashtag" w:semiHidden="1" w:unhideWhenUsed="1"/>
+    <w:lsdException w:name="Unresolved Mention" w:semiHidden="1" w:unhideWhenUsed="1"/>
+    <w:lsdException w:name="Smart Link" w:semiHidden="1" w:unhideWhenUsed="1"/>
   </w:latentStyles>
   <w:style w:type="paragraph" w:default="1" w:styleId="Normal">
     <w:name w:val="Normal"/>
@@ -6649,7 +6665,6 @@
   <w:style w:type="character" w:default="1" w:styleId="Fontepargpadro">
     <w:name w:val="Default Paragraph Font"/>
     <w:uiPriority w:val="1"/>
-    <w:semiHidden/>
     <w:unhideWhenUsed/>
   </w:style>
   <w:style w:type="table" w:default="1" w:styleId="Tabelanormal">

</xml_diff>